<commit_message>
Updated 'issuefee' email and added attachment. Worked on 'pctcorrect' UI
</commit_message>
<xml_diff>
--- a/project/documents/multidocmerge/issuefee.docx
+++ b/project/documents/multidocmerge/issuefee.docx
@@ -969,1034 +969,6 @@
         <w:rPr>
           <w:sz w:val="24"/>
           <w:szCs w:val="24"/>
-        </w:rPr>
-      </w:pPr>
-    </w:p>
-    <w:p>
-      <w:r>
-        <w:br w:type="page"/>
-      </w:r>
-    </w:p>
-    <w:p>
-      <w:pPr>
-        <w:tabs>
-          <w:tab w:val="right" w:pos="9360"/>
-        </w:tabs>
-        <w:autoSpaceDE w:val="0"/>
-        <w:autoSpaceDN w:val="0"/>
-        <w:adjustRightInd w:val="0"/>
-        <w:spacing w:line="300" w:lineRule="auto"/>
-        <w:rPr>
-          <w:b/>
-          <w:bCs/>
-          <w:noProof/>
-          <w:sz w:val="24"/>
-          <w:u w:val="single"/>
-        </w:rPr>
-      </w:pPr>
-      <w:r>
-        <w:rPr>
-          <w:b/>
-          <w:bCs/>
-          <w:noProof/>
-          <w:sz w:val="24"/>
-          <w:u w:val="single"/>
-        </w:rPr>
-        <w:t xml:space="preserve">S/N </w:t>
-      </w:r>
-      <w:r>
-        <w:rPr>
-          <w:b/>
-          <w:bCs/>
-          <w:noProof/>
-          <w:sz w:val="24"/>
-          <w:u w:val="single"/>
-        </w:rPr>
-        <w:t>&lt;&lt;serialNo&gt;&gt;</w:t>
-      </w:r>
-      <w:r>
-        <w:rPr>
-          <w:b/>
-          <w:bCs/>
-          <w:noProof/>
-          <w:sz w:val="24"/>
-        </w:rPr>
-        <w:tab/>
-      </w:r>
-      <w:r>
-        <w:rPr>
-          <w:b/>
-          <w:bCs/>
-          <w:noProof/>
-          <w:sz w:val="24"/>
-          <w:u w:val="single"/>
-        </w:rPr>
-        <w:t>PATENT</w:t>
-      </w:r>
-    </w:p>
-    <w:p>
-      <w:pPr>
-        <w:pStyle w:val="Heading5"/>
-        <w:keepNext w:val="0"/>
-        <w:spacing w:line="300" w:lineRule="auto"/>
-        <w:rPr>
-          <w:noProof/>
-        </w:rPr>
-      </w:pPr>
-      <w:r>
-        <w:rPr>
-          <w:noProof/>
-        </w:rPr>
-        <w:t>IN THE UNITED STATES PATENT AND TRADEMARK OFFICE</w:t>
-      </w:r>
-    </w:p>
-    <w:p>
-      <w:pPr>
-        <w:tabs>
-          <w:tab w:val="left" w:pos="-1440"/>
-          <w:tab w:val="left" w:pos="1440"/>
-          <w:tab w:val="left" w:pos="5400"/>
-        </w:tabs>
-        <w:spacing w:line="300" w:lineRule="auto"/>
-        <w:ind w:left="1440" w:hanging="1440"/>
-        <w:rPr>
-          <w:noProof/>
-          <w:sz w:val="24"/>
-        </w:rPr>
-      </w:pPr>
-      <w:r>
-        <w:rPr>
-          <w:noProof/>
-          <w:sz w:val="24"/>
-        </w:rPr>
-        <w:t>Inventor(s):     &lt;&lt;inventorEtal&gt;&gt;</w:t>
-      </w:r>
-      <w:r>
-        <w:rPr>
-          <w:noProof/>
-          <w:sz w:val="24"/>
-          <w:lang w:val="fr-FR"/>
-        </w:rPr>
-        <w:tab/>
-      </w:r>
-      <w:r>
-        <w:rPr>
-          <w:noProof/>
-          <w:sz w:val="24"/>
-        </w:rPr>
-        <w:t xml:space="preserve">Examiner: </w:t>
-      </w:r>
-      <w:r>
-        <w:rPr>
-          <w:sz w:val="24"/>
-          <w:szCs w:val="24"/>
-        </w:rPr>
-        <w:t>&lt;&lt;examinerName&gt;&gt;</w:t>
-      </w:r>
-    </w:p>
-    <w:p>
-      <w:pPr>
-        <w:tabs>
-          <w:tab w:val="left" w:pos="1440"/>
-          <w:tab w:val="left" w:pos="5400"/>
-        </w:tabs>
-        <w:spacing w:line="300" w:lineRule="auto"/>
-        <w:ind w:left="1440" w:hanging="1440"/>
-        <w:rPr>
-          <w:noProof/>
-          <w:sz w:val="24"/>
-        </w:rPr>
-      </w:pPr>
-      <w:r>
-        <w:rPr>
-          <w:noProof/>
-          <w:sz w:val="24"/>
-        </w:rPr>
-        <w:t xml:space="preserve">Serial No.: </w:t>
-      </w:r>
-      <w:r>
-        <w:rPr>
-          <w:noProof/>
-          <w:sz w:val="24"/>
-        </w:rPr>
-        <w:tab/>
-      </w:r>
-      <w:r>
-        <w:rPr>
-          <w:noProof/>
-          <w:sz w:val="24"/>
-        </w:rPr>
-        <w:t>&lt;&lt;serialNo&gt;&gt;</w:t>
-      </w:r>
-      <w:r>
-        <w:rPr>
-          <w:noProof/>
-          <w:sz w:val="24"/>
-        </w:rPr>
-        <w:tab/>
-        <w:t xml:space="preserve">Group Art Unit: </w:t>
-      </w:r>
-      <w:r>
-        <w:rPr>
-          <w:sz w:val="24"/>
-          <w:szCs w:val="24"/>
-        </w:rPr>
-        <w:t>&lt;&lt;artUnit&gt;&gt;</w:t>
-      </w:r>
-    </w:p>
-    <w:p>
-      <w:pPr>
-        <w:tabs>
-          <w:tab w:val="left" w:pos="1440"/>
-          <w:tab w:val="left" w:pos="5400"/>
-        </w:tabs>
-        <w:spacing w:line="300" w:lineRule="auto"/>
-        <w:ind w:left="1440" w:hanging="1440"/>
-        <w:rPr>
-          <w:noProof/>
-          <w:sz w:val="24"/>
-          <w:szCs w:val="24"/>
-        </w:rPr>
-      </w:pPr>
-      <w:r>
-        <w:rPr>
-          <w:noProof/>
-          <w:sz w:val="24"/>
-        </w:rPr>
-        <w:t xml:space="preserve">Filed: </w:t>
-      </w:r>
-      <w:r>
-        <w:rPr>
-          <w:noProof/>
-          <w:sz w:val="24"/>
-        </w:rPr>
-        <w:tab/>
-      </w:r>
-      <w:r>
-        <w:rPr>
-          <w:noProof/>
-          <w:sz w:val="24"/>
-        </w:rPr>
-        <w:t>&lt;&lt;filedDate&gt;&gt;</w:t>
-      </w:r>
-      <w:r>
-        <w:rPr>
-          <w:noProof/>
-          <w:sz w:val="24"/>
-        </w:rPr>
-        <w:tab/>
-        <w:t xml:space="preserve">Docket No.: </w:t>
-      </w:r>
-      <w:r>
-        <w:rPr>
-          <w:noProof/>
-          <w:sz w:val="24"/>
-        </w:rPr>
-        <w:t>&lt;&lt;matterNo&gt;&gt;</w:t>
-      </w:r>
-    </w:p>
-    <w:p>
-      <w:pPr>
-        <w:tabs>
-          <w:tab w:val="left" w:pos="1440"/>
-          <w:tab w:val="left" w:pos="5400"/>
-        </w:tabs>
-        <w:spacing w:line="300" w:lineRule="auto"/>
-        <w:ind w:left="1440" w:hanging="1440"/>
-        <w:rPr>
-          <w:noProof/>
-          <w:sz w:val="24"/>
-          <w:szCs w:val="24"/>
-        </w:rPr>
-      </w:pPr>
-      <w:r>
-        <w:rPr>
-          <w:sz w:val="24"/>
-          <w:szCs w:val="24"/>
-        </w:rPr>
-        <w:t xml:space="preserve">Customer No.: </w:t>
-      </w:r>
-      <w:r>
-        <w:rPr>
-          <w:sz w:val="24"/>
-        </w:rPr>
-        <w:t>&lt;&lt;custNoCorresp&gt;&gt;</w:t>
-      </w:r>
-      <w:r>
-        <w:rPr>
-          <w:sz w:val="24"/>
-        </w:rPr>
-        <w:tab/>
-      </w:r>
-      <w:r>
-        <w:rPr>
-          <w:sz w:val="24"/>
-          <w:szCs w:val="24"/>
-        </w:rPr>
-        <w:t xml:space="preserve">Confirmation No.: </w:t>
-      </w:r>
-      <w:r>
-        <w:rPr>
-          <w:sz w:val="24"/>
-        </w:rPr>
-        <w:t>&lt;&lt;confirmNo&gt;&gt;</w:t>
-      </w:r>
-    </w:p>
-    <w:p>
-      <w:pPr>
-        <w:pBdr>
-          <w:bottom w:val="single" w:sz="4" w:space="1" w:color="auto"/>
-        </w:pBdr>
-        <w:tabs>
-          <w:tab w:val="left" w:pos="1440"/>
-        </w:tabs>
-        <w:spacing w:line="300" w:lineRule="auto"/>
-        <w:ind w:left="1440" w:hanging="1440"/>
-        <w:rPr>
-          <w:noProof/>
-          <w:sz w:val="24"/>
-        </w:rPr>
-      </w:pPr>
-      <w:r>
-        <w:rPr>
-          <w:noProof/>
-          <w:sz w:val="24"/>
-          <w:szCs w:val="24"/>
-        </w:rPr>
-        <w:t>Title:</w:t>
-      </w:r>
-      <w:r>
-        <w:rPr>
-          <w:noProof/>
-          <w:sz w:val="24"/>
-          <w:szCs w:val="24"/>
-        </w:rPr>
-        <w:tab/>
-      </w:r>
-      <w:r>
-        <w:rPr>
-          <w:noProof/>
-          <w:sz w:val="24"/>
-          <w:szCs w:val="24"/>
-        </w:rPr>
-        <w:t>&lt;&lt;title&gt;&gt;</w:t>
-      </w:r>
-    </w:p>
-    <w:p>
-      <w:pPr>
-        <w:spacing w:line="300" w:lineRule="auto"/>
-        <w:rPr>
-          <w:noProof/>
-        </w:rPr>
-      </w:pPr>
-    </w:p>
-    <w:p>
-      <w:pPr>
-        <w:pStyle w:val="Heading5"/>
-        <w:keepNext w:val="0"/>
-        <w:rPr>
-          <w:rFonts w:ascii="Times New Roman" w:hAnsi="Times New Roman"/>
-          <w:bCs w:val="0"/>
-          <w:noProof/>
-        </w:rPr>
-      </w:pPr>
-      <w:r>
-        <w:rPr>
-          <w:noProof/>
-          <w:szCs w:val="22"/>
-        </w:rPr>
-        <w:t>REQUEST TO APPLY PREVIOUSLY PAID ISSUE FEE</w:t>
-      </w:r>
-    </w:p>
-    <w:p>
-      <w:pPr>
-        <w:rPr>
-          <w:noProof/>
-        </w:rPr>
-      </w:pPr>
-    </w:p>
-    <w:p>
-      <w:pPr>
-        <w:autoSpaceDE w:val="0"/>
-        <w:autoSpaceDN w:val="0"/>
-        <w:adjustRightInd w:val="0"/>
-        <w:rPr>
-          <w:noProof/>
-          <w:sz w:val="24"/>
-          <w:szCs w:val="24"/>
-        </w:rPr>
-      </w:pPr>
-      <w:r>
-        <w:rPr>
-          <w:noProof/>
-          <w:sz w:val="24"/>
-          <w:szCs w:val="24"/>
-        </w:rPr>
-        <w:t>Mail Stop Issue Fee</w:t>
-      </w:r>
-    </w:p>
-    <w:p>
-      <w:pPr>
-        <w:autoSpaceDE w:val="0"/>
-        <w:autoSpaceDN w:val="0"/>
-        <w:adjustRightInd w:val="0"/>
-        <w:rPr>
-          <w:noProof/>
-          <w:sz w:val="24"/>
-          <w:szCs w:val="24"/>
-        </w:rPr>
-      </w:pPr>
-      <w:r>
-        <w:rPr>
-          <w:noProof/>
-          <w:sz w:val="24"/>
-          <w:szCs w:val="24"/>
-        </w:rPr>
-        <w:t>Commissioner for Patents</w:t>
-      </w:r>
-    </w:p>
-    <w:p>
-      <w:pPr>
-        <w:autoSpaceDE w:val="0"/>
-        <w:autoSpaceDN w:val="0"/>
-        <w:adjustRightInd w:val="0"/>
-        <w:rPr>
-          <w:noProof/>
-          <w:sz w:val="24"/>
-          <w:szCs w:val="24"/>
-        </w:rPr>
-      </w:pPr>
-      <w:smartTag w:uri="urn:schemas-microsoft-com:office:smarttags" w:element="address">
-        <w:smartTag w:uri="urn:schemas-microsoft-com:office:smarttags" w:element="Street">
-          <w:r>
-            <w:rPr>
-              <w:noProof/>
-              <w:sz w:val="24"/>
-              <w:szCs w:val="24"/>
-            </w:rPr>
-            <w:t>P.O.Box</w:t>
-          </w:r>
-        </w:smartTag>
-        <w:r>
-          <w:rPr>
-            <w:noProof/>
-            <w:sz w:val="24"/>
-            <w:szCs w:val="24"/>
-          </w:rPr>
-          <w:t xml:space="preserve"> 1450</w:t>
-        </w:r>
-      </w:smartTag>
-    </w:p>
-    <w:p>
-      <w:pPr>
-        <w:autoSpaceDE w:val="0"/>
-        <w:autoSpaceDN w:val="0"/>
-        <w:adjustRightInd w:val="0"/>
-        <w:rPr>
-          <w:noProof/>
-          <w:sz w:val="24"/>
-          <w:szCs w:val="24"/>
-        </w:rPr>
-      </w:pPr>
-      <w:r>
-        <w:rPr>
-          <w:noProof/>
-          <w:sz w:val="24"/>
-          <w:szCs w:val="24"/>
-        </w:rPr>
-        <w:t>Alexandria, VA 22313-1450</w:t>
-      </w:r>
-    </w:p>
-    <w:p>
-      <w:pPr>
-        <w:autoSpaceDE w:val="0"/>
-        <w:autoSpaceDN w:val="0"/>
-        <w:adjustRightInd w:val="0"/>
-        <w:rPr>
-          <w:noProof/>
-        </w:rPr>
-      </w:pPr>
-    </w:p>
-    <w:p>
-      <w:pPr>
-        <w:pStyle w:val="BodyTextIndent"/>
-        <w:spacing w:line="300" w:lineRule="auto"/>
-        <w:ind w:left="0" w:firstLine="734"/>
-        <w:rPr>
-          <w:noProof/>
-        </w:rPr>
-      </w:pPr>
-      <w:r>
-        <w:rPr>
-          <w:noProof/>
-        </w:rPr>
-        <w:t xml:space="preserve">An issue fee for the above-identified application was previously paid on </w:t>
-      </w:r>
-      <w:r>
-        <w:rPr>
-          <w:noProof/>
-        </w:rPr>
-        <w:t>&lt;&lt;</w:t>
-      </w:r>
-      <w:r>
-        <w:rPr>
-          <w:noProof/>
-        </w:rPr>
-        <w:t>date</w:t>
-      </w:r>
-      <w:r>
-        <w:rPr>
-          <w:noProof/>
-        </w:rPr>
-        <w:t>IssueFee</w:t>
-      </w:r>
-      <w:r>
-        <w:rPr>
-          <w:noProof/>
-        </w:rPr>
-        <w:t>&gt;&gt;</w:t>
-      </w:r>
-      <w:r>
-        <w:rPr>
-          <w:noProof/>
-        </w:rPr>
-        <w:t xml:space="preserve">.  </w:t>
-      </w:r>
-      <w:r>
-        <w:rPr>
-          <w:noProof/>
-        </w:rPr>
-        <w:t>&lt;&lt;withDrawText&gt;&gt;</w:t>
-      </w:r>
-    </w:p>
-    <w:p>
-      <w:pPr>
-        <w:spacing w:line="300" w:lineRule="auto"/>
-        <w:ind w:firstLine="720"/>
-        <w:rPr>
-          <w:noProof/>
-          <w:sz w:val="24"/>
-          <w:szCs w:val="22"/>
-        </w:rPr>
-      </w:pPr>
-      <w:r>
-        <w:rPr>
-          <w:noProof/>
-          <w:sz w:val="24"/>
-          <w:szCs w:val="22"/>
-        </w:rPr>
-        <w:t>Applicant respectfully requests that the above-identified previously-p</w:t>
-      </w:r>
-      <w:r>
-        <w:rPr>
-          <w:noProof/>
-          <w:sz w:val="24"/>
-          <w:szCs w:val="22"/>
-        </w:rPr>
-        <w:t>aid issue fee be applied toward</w:t>
-      </w:r>
-      <w:r>
-        <w:rPr>
-          <w:noProof/>
-          <w:sz w:val="24"/>
-          <w:szCs w:val="22"/>
-        </w:rPr>
-        <w:t xml:space="preserve"> the fee required by the new Notice of Allowance dated </w:t>
-      </w:r>
-      <w:r>
-        <w:rPr>
-          <w:noProof/>
-          <w:sz w:val="24"/>
-          <w:szCs w:val="22"/>
-        </w:rPr>
-        <w:t>&lt;&lt;dateNOAR&gt;&gt;.</w:t>
-      </w:r>
-      <w:r>
-        <w:rPr>
-          <w:noProof/>
-          <w:sz w:val="24"/>
-          <w:szCs w:val="22"/>
-        </w:rPr>
-        <w:t xml:space="preserve">  </w:t>
-      </w:r>
-      <w:r>
-        <w:rPr>
-          <w:noProof/>
-          <w:sz w:val="24"/>
-          <w:szCs w:val="22"/>
-        </w:rPr>
-        <w:t>&lt;&lt;increaseText&gt;&gt;</w:t>
-      </w:r>
-    </w:p>
-    <w:p>
-      <w:pPr>
-        <w:spacing w:line="300" w:lineRule="auto"/>
-        <w:ind w:firstLine="720"/>
-        <w:rPr>
-          <w:noProof/>
-          <w:sz w:val="24"/>
-          <w:szCs w:val="24"/>
-        </w:rPr>
-      </w:pPr>
-      <w:r>
-        <w:rPr>
-          <w:noProof/>
-          <w:sz w:val="24"/>
-          <w:szCs w:val="22"/>
-        </w:rPr>
-        <w:t xml:space="preserve">This request is being submitted </w:t>
-      </w:r>
-      <w:r>
-        <w:rPr>
-          <w:noProof/>
-          <w:sz w:val="24"/>
-          <w:szCs w:val="22"/>
-        </w:rPr>
-        <w:t xml:space="preserve">together </w:t>
-      </w:r>
-      <w:r>
-        <w:rPr>
-          <w:noProof/>
-          <w:sz w:val="24"/>
-          <w:szCs w:val="22"/>
-        </w:rPr>
-        <w:t>with the new Issue Fee Transmittal Form PTOL</w:t>
-      </w:r>
-      <w:r>
-        <w:rPr>
-          <w:noProof/>
-          <w:sz w:val="24"/>
-          <w:szCs w:val="22"/>
-        </w:rPr>
-        <w:noBreakHyphen/>
-      </w:r>
-      <w:r>
-        <w:rPr>
-          <w:noProof/>
-          <w:sz w:val="24"/>
-          <w:szCs w:val="22"/>
-        </w:rPr>
-        <w:t>85</w:t>
-      </w:r>
-      <w:r>
-        <w:rPr>
-          <w:noProof/>
-          <w:sz w:val="24"/>
-          <w:szCs w:val="22"/>
-        </w:rPr>
-        <w:t>&lt;&lt;withdrawCopyText&gt;&gt;</w:t>
-      </w:r>
-      <w:r>
-        <w:rPr>
-          <w:noProof/>
-          <w:sz w:val="24"/>
-          <w:szCs w:val="22"/>
-        </w:rPr>
-        <w:t xml:space="preserve">  </w:t>
-      </w:r>
-      <w:r>
-        <w:rPr>
-          <w:bCs/>
-          <w:noProof/>
-          <w:sz w:val="24"/>
-          <w:szCs w:val="22"/>
-        </w:rPr>
-        <w:t>Please charge any additio</w:t>
-      </w:r>
-      <w:r>
-        <w:rPr>
-          <w:bCs/>
-          <w:noProof/>
-          <w:sz w:val="24"/>
-          <w:szCs w:val="22"/>
-        </w:rPr>
-        <w:t xml:space="preserve">nal required fees </w:t>
-      </w:r>
-      <w:r>
-        <w:rPr>
-          <w:bCs/>
-          <w:noProof/>
-          <w:sz w:val="24"/>
-          <w:szCs w:val="22"/>
-        </w:rPr>
-        <w:t xml:space="preserve">or credit overpayment to Deposit Account No. </w:t>
-      </w:r>
-      <w:r>
-        <w:rPr>
-          <w:bCs/>
-          <w:noProof/>
-          <w:sz w:val="24"/>
-        </w:rPr>
-        <w:t>&lt;&lt;depAccount&gt;&gt;</w:t>
-      </w:r>
-      <w:r>
-        <w:rPr>
-          <w:noProof/>
-          <w:sz w:val="24"/>
-        </w:rPr>
-        <w:t xml:space="preserve">.  </w:t>
-      </w:r>
-      <w:r>
-        <w:rPr>
-          <w:noProof/>
-          <w:sz w:val="24"/>
-          <w:szCs w:val="24"/>
-        </w:rPr>
-        <w:t xml:space="preserve">Please direct any inquiries to the undersigned attorney at </w:t>
-      </w:r>
-      <w:r>
-        <w:rPr>
-          <w:noProof/>
-          <w:sz w:val="24"/>
-          <w:szCs w:val="24"/>
-        </w:rPr>
-        <w:t>&lt;&lt;SAPhone&gt;&gt;.</w:t>
-      </w:r>
-    </w:p>
-    <w:p>
-      <w:pPr>
-        <w:autoSpaceDE w:val="0"/>
-        <w:autoSpaceDN w:val="0"/>
-        <w:adjustRightInd w:val="0"/>
-        <w:rPr>
-          <w:noProof/>
-        </w:rPr>
-      </w:pPr>
-    </w:p>
-    <w:p>
-      <w:pPr>
-        <w:autoSpaceDE w:val="0"/>
-        <w:autoSpaceDN w:val="0"/>
-        <w:adjustRightInd w:val="0"/>
-        <w:ind w:left="3600"/>
-        <w:rPr>
-          <w:noProof/>
-          <w:sz w:val="24"/>
-          <w:szCs w:val="24"/>
-        </w:rPr>
-      </w:pPr>
-      <w:r>
-        <w:rPr>
-          <w:noProof/>
-          <w:sz w:val="24"/>
-          <w:szCs w:val="24"/>
-        </w:rPr>
-        <w:t>Respectfully submitted,</w:t>
-      </w:r>
-    </w:p>
-    <w:p>
-      <w:pPr>
-        <w:autoSpaceDE w:val="0"/>
-        <w:autoSpaceDN w:val="0"/>
-        <w:adjustRightInd w:val="0"/>
-        <w:rPr>
-          <w:noProof/>
-          <w:sz w:val="16"/>
-          <w:szCs w:val="16"/>
-        </w:rPr>
-      </w:pPr>
-    </w:p>
-    <w:p>
-      <w:pPr>
-        <w:autoSpaceDE w:val="0"/>
-        <w:autoSpaceDN w:val="0"/>
-        <w:adjustRightInd w:val="0"/>
-        <w:ind w:left="3600"/>
-        <w:rPr>
-          <w:noProof/>
-          <w:sz w:val="22"/>
-          <w:szCs w:val="22"/>
-        </w:rPr>
-      </w:pPr>
-      <w:r>
-        <w:rPr>
-          <w:noProof/>
-          <w:sz w:val="22"/>
-          <w:szCs w:val="22"/>
-        </w:rPr>
-        <w:t>&lt;&lt;</w:t>
-      </w:r>
-      <w:r>
-        <w:rPr>
-          <w:noProof/>
-          <w:sz w:val="22"/>
-          <w:szCs w:val="22"/>
-        </w:rPr>
-        <w:t>upperF</w:t>
-      </w:r>
-      <w:r>
-        <w:rPr>
-          <w:noProof/>
-          <w:sz w:val="22"/>
-          <w:szCs w:val="22"/>
-        </w:rPr>
-        <w:t>irmName&gt;&gt;</w:t>
-      </w:r>
-    </w:p>
-    <w:p>
-      <w:pPr>
-        <w:autoSpaceDE w:val="0"/>
-        <w:autoSpaceDN w:val="0"/>
-        <w:adjustRightInd w:val="0"/>
-        <w:ind w:left="3600"/>
-        <w:rPr>
-          <w:noProof/>
-          <w:sz w:val="24"/>
-          <w:szCs w:val="24"/>
-        </w:rPr>
-      </w:pPr>
-      <w:smartTag w:uri="urn:schemas-microsoft-com:office:smarttags" w:element="country-region">
-        <w:smartTag w:uri="urn:schemas-microsoft-com:office:smarttags" w:element="place">
-          <w:r>
-            <w:rPr>
-              <w:noProof/>
-              <w:sz w:val="24"/>
-              <w:szCs w:val="24"/>
-            </w:rPr>
-            <w:t>P.O. Box</w:t>
-          </w:r>
-        </w:smartTag>
-        <w:r>
-          <w:rPr>
-            <w:noProof/>
-            <w:sz w:val="24"/>
-            <w:szCs w:val="24"/>
-          </w:rPr>
-          <w:t xml:space="preserve"> 2938</w:t>
-        </w:r>
-      </w:smartTag>
-    </w:p>
-    <w:p>
-      <w:pPr>
-        <w:autoSpaceDE w:val="0"/>
-        <w:autoSpaceDN w:val="0"/>
-        <w:adjustRightInd w:val="0"/>
-        <w:ind w:left="3600"/>
-        <w:rPr>
-          <w:noProof/>
-          <w:sz w:val="24"/>
-          <w:szCs w:val="24"/>
-        </w:rPr>
-      </w:pPr>
-      <w:r>
-        <w:rPr>
-          <w:noProof/>
-          <w:sz w:val="24"/>
-          <w:szCs w:val="24"/>
-        </w:rPr>
-        <w:t>Minneapolis, MN 55402</w:t>
-      </w:r>
-    </w:p>
-    <w:p>
-      <w:pPr>
-        <w:autoSpaceDE w:val="0"/>
-        <w:autoSpaceDN w:val="0"/>
-        <w:adjustRightInd w:val="0"/>
-        <w:ind w:left="3600"/>
-        <w:rPr>
-          <w:noProof/>
-          <w:sz w:val="24"/>
-          <w:szCs w:val="24"/>
-        </w:rPr>
-      </w:pPr>
-      <w:r>
-        <w:rPr>
-          <w:noProof/>
-          <w:sz w:val="24"/>
-          <w:szCs w:val="24"/>
-        </w:rPr>
-        <w:t>&lt;&lt;SAPhone&gt;&gt;</w:t>
-      </w:r>
-    </w:p>
-    <w:p>
-      <w:pPr>
-        <w:autoSpaceDE w:val="0"/>
-        <w:autoSpaceDN w:val="0"/>
-        <w:adjustRightInd w:val="0"/>
-        <w:rPr>
-          <w:noProof/>
-          <w:sz w:val="24"/>
-          <w:szCs w:val="24"/>
-        </w:rPr>
-      </w:pPr>
-    </w:p>
-    <w:p>
-      <w:pPr>
-        <w:tabs>
-          <w:tab w:val="left" w:pos="720"/>
-          <w:tab w:val="left" w:pos="4050"/>
-        </w:tabs>
-        <w:rPr>
-          <w:sz w:val="24"/>
-          <w:szCs w:val="24"/>
-        </w:rPr>
-      </w:pPr>
-      <w:r>
-        <w:rPr>
-          <w:sz w:val="24"/>
-          <w:szCs w:val="24"/>
-        </w:rPr>
-        <w:tab/>
-        <w:t>&lt;&lt;signatureDate&gt;&gt;</w:t>
-      </w:r>
-      <w:r>
-        <w:rPr>
-          <w:sz w:val="24"/>
-          <w:szCs w:val="24"/>
-        </w:rPr>
-        <w:tab/>
-      </w:r>
-      <w:r>
-        <w:rPr>
-          <w:sz w:val="24"/>
-          <w:szCs w:val="24"/>
-        </w:rPr>
-        <w:t xml:space="preserve">       </w:t>
-      </w:r>
-      <w:r>
-        <w:rPr>
-          <w:sz w:val="24"/>
-          <w:szCs w:val="24"/>
-        </w:rPr>
-        <w:t xml:space="preserve">  </w:t>
-      </w:r>
-      <w:r>
-        <w:rPr>
-          <w:sz w:val="32"/>
-          <w:szCs w:val="32"/>
-        </w:rPr>
-        <w:t>&lt;&lt;echoSignature&gt;&gt;</w:t>
-      </w:r>
-    </w:p>
-    <w:p>
-      <w:pPr>
-        <w:pStyle w:val="Heading6"/>
-        <w:keepNext w:val="0"/>
-        <w:tabs>
-          <w:tab w:val="left" w:pos="3960"/>
-        </w:tabs>
-        <w:rPr>
-          <w:rFonts w:ascii="Times New Roman" w:hAnsi="Times New Roman"/>
-          <w:noProof/>
-          <w:u w:val="none"/>
-        </w:rPr>
-      </w:pPr>
-      <w:r>
-        <w:rPr>
-          <w:rFonts w:ascii="Times New Roman" w:hAnsi="Times New Roman"/>
-          <w:noProof/>
-          <w:u w:val="none"/>
-        </w:rPr>
-        <w:t>Date __________________________</w:t>
-      </w:r>
-      <w:r>
-        <w:rPr>
-          <w:rFonts w:ascii="Times New Roman" w:hAnsi="Times New Roman"/>
-          <w:noProof/>
-          <w:u w:val="none"/>
-        </w:rPr>
-        <w:tab/>
-        <w:t>By _______________________________________</w:t>
-      </w:r>
-    </w:p>
-    <w:p>
-      <w:pPr>
-        <w:pStyle w:val="Heading7"/>
-        <w:keepNext w:val="0"/>
-        <w:tabs>
-          <w:tab w:val="left" w:pos="4320"/>
-        </w:tabs>
-        <w:ind w:left="0"/>
-        <w:rPr>
-          <w:rFonts w:ascii="Times New Roman" w:hAnsi="Times New Roman"/>
-          <w:noProof/>
-        </w:rPr>
-      </w:pPr>
-      <w:r>
-        <w:rPr>
-          <w:rFonts w:ascii="Times New Roman" w:hAnsi="Times New Roman"/>
-          <w:noProof/>
-        </w:rPr>
-        <w:tab/>
-      </w:r>
-      <w:r>
-        <w:rPr>
-          <w:rFonts w:ascii="Times New Roman" w:hAnsi="Times New Roman"/>
-          <w:noProof/>
-        </w:rPr>
-        <w:t>&lt;&lt;SAName&gt;&gt;</w:t>
-      </w:r>
-    </w:p>
-    <w:p>
-      <w:pPr>
-        <w:pStyle w:val="Heading7"/>
-        <w:keepNext w:val="0"/>
-        <w:tabs>
-          <w:tab w:val="left" w:pos="4320"/>
-        </w:tabs>
-        <w:ind w:left="0"/>
-        <w:rPr>
-          <w:rFonts w:ascii="Times New Roman" w:hAnsi="Times New Roman"/>
-          <w:noProof/>
-        </w:rPr>
-      </w:pPr>
-      <w:r>
-        <w:rPr>
-          <w:rFonts w:cs="Dutch801 Rm BT"/>
-          <w:sz w:val="18"/>
-          <w:szCs w:val="18"/>
-        </w:rPr>
-        <w:t>&lt;&lt;nickSA&gt;&gt;</w:t>
-      </w:r>
-      <w:r>
-        <w:rPr>
-          <w:rFonts w:cs="Dutch801 Rm BT"/>
-          <w:sz w:val="18"/>
-          <w:szCs w:val="18"/>
-        </w:rPr>
-        <w:t>:CMG:</w:t>
-      </w:r>
-      <w:r>
-        <w:rPr>
-          <w:rFonts w:cs="Dutch801 Rm BT"/>
-          <w:sz w:val="18"/>
-          <w:szCs w:val="18"/>
-        </w:rPr>
-        <w:t>&lt;&lt;nickU&gt;&gt;</w:t>
-      </w:r>
-      <w:r>
-        <w:tab/>
-      </w:r>
-      <w:r>
-        <w:rPr>
-          <w:rFonts w:ascii="Times New Roman" w:hAnsi="Times New Roman" w:cs="Times New Roman TUR"/>
-          <w:noProof/>
-          <w:szCs w:val="16"/>
-        </w:rPr>
-        <w:t xml:space="preserve">Reg. No. </w:t>
-      </w:r>
-      <w:r>
-        <w:t>&lt;&lt;SARegNo&gt;&gt;</w:t>
-      </w:r>
-    </w:p>
-    <w:p>
-      <w:pPr>
-        <w:rPr>
-          <w:sz w:val="16"/>
-          <w:szCs w:val="16"/>
-        </w:rPr>
-      </w:pPr>
-    </w:p>
-    <w:p>
-      <w:pPr>
-        <w:tabs>
-          <w:tab w:val="left" w:pos="4320"/>
-        </w:tabs>
-        <w:jc w:val="both"/>
-        <w:rPr>
-          <w:noProof/>
-          <w:sz w:val="18"/>
-          <w:szCs w:val="18"/>
         </w:rPr>
       </w:pPr>
     </w:p>

</xml_diff>